<commit_message>
update landing dengan feature pengaduan
</commit_message>
<xml_diff>
--- a/uploads/template_surat/surat_keterangan_dusun.docx
+++ b/uploads/template_surat/surat_keterangan_dusun.docx
@@ -186,7 +186,7 @@
           </mc:Choice>
           <mc:Fallback>
             <w:pict>
-              <v:line w14:anchorId="7009B08F" id="Straight Connector 2" o:spid="_x0000_s1026" style="position:absolute;z-index:251661312;visibility:visible;mso-wrap-style:square;mso-wrap-distance-left:9pt;mso-wrap-distance-top:0;mso-wrap-distance-right:9pt;mso-wrap-distance-bottom:0;mso-position-horizontal:absolute;mso-position-horizontal-relative:text;mso-position-vertical:absolute;mso-position-vertical-relative:text" from="3pt,28.25pt" to="435.35pt,28.25pt" o:gfxdata="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" strokecolor="black [3213]" strokeweight="2pt">
+              <v:line w14:anchorId="09E81C71" id="Straight Connector 2" o:spid="_x0000_s1026" style="position:absolute;z-index:251661312;visibility:visible;mso-wrap-style:square;mso-wrap-distance-left:9pt;mso-wrap-distance-top:0;mso-wrap-distance-right:9pt;mso-wrap-distance-bottom:0;mso-position-horizontal:absolute;mso-position-horizontal-relative:text;mso-position-vertical:absolute;mso-position-vertical-relative:text" from="3pt,28.25pt" to="435.35pt,28.25pt" o:gfxdata="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" strokecolor="black [3213]" strokeweight="2pt">
                 <v:shadow on="t" color="black" opacity="24903f" origin=",.5" offset="0,.55556mm"/>
               </v:line>
             </w:pict>
@@ -772,23 +772,21 @@
       </w:r>
       <w:proofErr w:type="spellStart"/>
       <w:r>
-        <w:t>tempat_</w:t>
-      </w:r>
-      <w:proofErr w:type="gramStart"/>
-      <w:r>
-        <w:t>lahir</w:t>
+        <w:t>tempat_lahir</w:t>
       </w:r>
       <w:proofErr w:type="spellEnd"/>
       <w:r>
         <w:t>}</w:t>
       </w:r>
       <w:r>
+        <w:t xml:space="preserve">, </w:t>
+      </w:r>
+      <w:r>
         <w:rPr>
           <w:rFonts w:ascii="Times New Roman" w:hAnsi="Times New Roman" w:cs="Times New Roman"/>
         </w:rPr>
         <w:t>$</w:t>
       </w:r>
-      <w:proofErr w:type="gramEnd"/>
       <w:r>
         <w:rPr>
           <w:rFonts w:ascii="Times New Roman" w:hAnsi="Times New Roman" w:cs="Times New Roman"/>
@@ -1268,21 +1266,7 @@
         <w:rPr>
           <w:rFonts w:ascii="Times New Roman" w:hAnsi="Times New Roman" w:cs="Times New Roman"/>
         </w:rPr>
-        <w:t xml:space="preserve"> kami </w:t>
-      </w:r>
-      <w:proofErr w:type="spellStart"/>
-      <w:r>
-        <w:rPr>
-          <w:rFonts w:ascii="Times New Roman" w:hAnsi="Times New Roman" w:cs="Times New Roman"/>
-        </w:rPr>
-        <w:t>buat</w:t>
-      </w:r>
-      <w:proofErr w:type="spellEnd"/>
-      <w:r>
-        <w:rPr>
-          <w:rFonts w:ascii="Times New Roman" w:hAnsi="Times New Roman" w:cs="Times New Roman"/>
-        </w:rPr>
-        <w:t xml:space="preserve"> </w:t>
+        <w:t xml:space="preserve"> kami buat </w:t>
       </w:r>
       <w:proofErr w:type="spellStart"/>
       <w:r>

</xml_diff>